<commit_message>
chore: mirror upstream 35c75ad
</commit_message>
<xml_diff>
--- a/templates/ts_template.docx
+++ b/templates/ts_template.docx
@@ -2,7 +2,10 @@
 <file path=word/document.xml><?xml version="1.0" encoding="utf-8"?>
 <w:document xmlns:wpc="http://schemas.microsoft.com/office/word/2010/wordprocessingCanvas" xmlns:mc="http://schemas.openxmlformats.org/markup-compatibility/2006" xmlns:o="urn:schemas-microsoft-com:office:office" xmlns:r="http://schemas.openxmlformats.org/officeDocument/2006/relationships" xmlns:m="http://schemas.openxmlformats.org/officeDocument/2006/math" xmlns:v="urn:schemas-microsoft-com:vml" xmlns:wp14="http://schemas.microsoft.com/office/word/2010/wordprocessingDrawing" xmlns:wp="http://schemas.openxmlformats.org/drawingml/2006/wordprocessingDrawing" xmlns:w10="urn:schemas-microsoft-com:office:word" xmlns:w="http://schemas.openxmlformats.org/wordprocessingml/2006/main" xmlns:w14="http://schemas.microsoft.com/office/word/2010/wordml" xmlns:wpg="http://schemas.microsoft.com/office/word/2010/wordprocessingGroup" xmlns:wpi="http://schemas.microsoft.com/office/word/2010/wordprocessingInk" xmlns:wne="http://schemas.microsoft.com/office/word/2006/wordml" xmlns:wps="http://schemas.microsoft.com/office/word/2010/wordprocessingShape" mc:Ignorable="w14 wp14">
   <w:body>
-    <w:p/>
+    <w:p>
+      <w:bookmarkStart w:id="0" w:name="_GoBack"/>
+      <w:bookmarkEnd w:id="0"/>
+    </w:p>
     <w:tbl>
       <w:tblPr>
         <w:tblStyle w:val="a5"/>
@@ -60,19 +63,7 @@
               <w:rPr>
                 <w:rFonts w:ascii="Arial Unicode MS" w:eastAsia="Arial Unicode MS" w:hAnsi="Arial Unicode MS" w:cs="Arial Unicode MS"/>
               </w:rPr>
-              <w:t>통합시험</w:t>
-            </w:r>
-            <w:r>
-              <w:rPr>
-                <w:rFonts w:ascii="Arial Unicode MS" w:eastAsia="Arial Unicode MS" w:hAnsi="Arial Unicode MS" w:cs="Arial Unicode MS"/>
-              </w:rPr>
-              <w:t xml:space="preserve"> </w:t>
-            </w:r>
-            <w:r>
-              <w:rPr>
-                <w:rFonts w:ascii="Arial Unicode MS" w:eastAsia="Arial Unicode MS" w:hAnsi="Arial Unicode MS" w:cs="Arial Unicode MS"/>
-              </w:rPr>
-              <w:t>시나리오</w:t>
+              <w:t>통합시험 시나리오</w:t>
             </w:r>
           </w:p>
         </w:tc>
@@ -387,22 +378,8 @@
         <w:rPr>
           <w:rFonts w:ascii="Arial Unicode MS" w:eastAsia="Arial Unicode MS" w:hAnsi="Arial Unicode MS" w:cs="Arial Unicode MS"/>
         </w:rPr>
-        <w:t>시험</w:t>
+        <w:t>시험 시나리오</w:t>
       </w:r>
-      <w:r>
-        <w:rPr>
-          <w:rFonts w:ascii="Arial Unicode MS" w:eastAsia="Arial Unicode MS" w:hAnsi="Arial Unicode MS" w:cs="Arial Unicode MS"/>
-        </w:rPr>
-        <w:t xml:space="preserve"> </w:t>
-      </w:r>
-      <w:r>
-        <w:rPr>
-          <w:rFonts w:ascii="Arial Unicode MS" w:eastAsia="Arial Unicode MS" w:hAnsi="Arial Unicode MS" w:cs="Arial Unicode MS"/>
-        </w:rPr>
-        <w:t>시나리오</w:t>
-      </w:r>
-      <w:bookmarkStart w:id="0" w:name="_GoBack"/>
-      <w:bookmarkEnd w:id="0"/>
     </w:p>
     <w:p/>
     <w:tbl>
@@ -460,69 +437,14 @@
               <w:rPr>
                 <w:rFonts w:ascii="Arial Unicode MS" w:eastAsia="Arial Unicode MS" w:hAnsi="Arial Unicode MS" w:cs="Arial Unicode MS"/>
               </w:rPr>
-              <w:t>시험시나리오</w:t>
+              <w:t>시험시나리오 ID</w:t>
             </w:r>
-            <w:r>
-              <w:rPr>
-                <w:rFonts w:ascii="Arial Unicode MS" w:eastAsia="Arial Unicode MS" w:hAnsi="Arial Unicode MS" w:cs="Arial Unicode MS"/>
-              </w:rPr>
-              <w:t xml:space="preserve"> ID</w:t>
-            </w:r>
-          </w:p>
-        </w:tc>
-        <w:tc>
-          <w:tcPr>
-            <w:tcW w:w="2791" w:type="dxa"/>
-            <w:shd w:val="clear" w:color="auto" w:fill="auto"/>
-            <w:tcMar>
-              <w:top w:w="100" w:type="dxa"/>
-              <w:left w:w="100" w:type="dxa"/>
-              <w:bottom w:w="100" w:type="dxa"/>
-              <w:right w:w="100" w:type="dxa"/>
-            </w:tcMar>
-          </w:tcPr>
-          <w:p>
-            <w:pPr>
-              <w:widowControl w:val="0"/>
-              <w:pBdr>
-                <w:top w:val="nil"/>
-                <w:left w:val="nil"/>
-                <w:bottom w:val="nil"/>
-                <w:right w:val="nil"/>
-                <w:between w:val="nil"/>
-              </w:pBdr>
-              <w:spacing w:line="240" w:lineRule="auto"/>
-            </w:pPr>
-          </w:p>
-        </w:tc>
-        <w:tc>
-          <w:tcPr>
-            <w:tcW w:w="2791" w:type="dxa"/>
-            <w:shd w:val="clear" w:color="auto" w:fill="auto"/>
-            <w:tcMar>
-              <w:top w:w="100" w:type="dxa"/>
-              <w:left w:w="100" w:type="dxa"/>
-              <w:bottom w:w="100" w:type="dxa"/>
-              <w:right w:w="100" w:type="dxa"/>
-            </w:tcMar>
-          </w:tcPr>
-          <w:p>
-            <w:pPr>
-              <w:widowControl w:val="0"/>
-              <w:pBdr>
-                <w:top w:val="nil"/>
-                <w:left w:val="nil"/>
-                <w:bottom w:val="nil"/>
-                <w:right w:val="nil"/>
-                <w:between w:val="nil"/>
-              </w:pBdr>
-              <w:spacing w:line="240" w:lineRule="auto"/>
-            </w:pPr>
-          </w:p>
-        </w:tc>
-        <w:tc>
-          <w:tcPr>
-            <w:tcW w:w="2791" w:type="dxa"/>
+          </w:p>
+        </w:tc>
+        <w:tc>
+          <w:tcPr>
+            <w:tcW w:w="8373" w:type="dxa"/>
+            <w:gridSpan w:val="3"/>
             <w:shd w:val="clear" w:color="auto" w:fill="auto"/>
             <w:tcMar>
               <w:top w:w="100" w:type="dxa"/>
@@ -586,57 +508,8 @@
         </w:tc>
         <w:tc>
           <w:tcPr>
-            <w:tcW w:w="2791" w:type="dxa"/>
-            <w:shd w:val="clear" w:color="auto" w:fill="auto"/>
-            <w:tcMar>
-              <w:top w:w="100" w:type="dxa"/>
-              <w:left w:w="100" w:type="dxa"/>
-              <w:bottom w:w="100" w:type="dxa"/>
-              <w:right w:w="100" w:type="dxa"/>
-            </w:tcMar>
-          </w:tcPr>
-          <w:p>
-            <w:pPr>
-              <w:widowControl w:val="0"/>
-              <w:pBdr>
-                <w:top w:val="nil"/>
-                <w:left w:val="nil"/>
-                <w:bottom w:val="nil"/>
-                <w:right w:val="nil"/>
-                <w:between w:val="nil"/>
-              </w:pBdr>
-              <w:spacing w:line="240" w:lineRule="auto"/>
-            </w:pPr>
-          </w:p>
-        </w:tc>
-        <w:tc>
-          <w:tcPr>
-            <w:tcW w:w="2791" w:type="dxa"/>
-            <w:shd w:val="clear" w:color="auto" w:fill="auto"/>
-            <w:tcMar>
-              <w:top w:w="100" w:type="dxa"/>
-              <w:left w:w="100" w:type="dxa"/>
-              <w:bottom w:w="100" w:type="dxa"/>
-              <w:right w:w="100" w:type="dxa"/>
-            </w:tcMar>
-          </w:tcPr>
-          <w:p>
-            <w:pPr>
-              <w:widowControl w:val="0"/>
-              <w:pBdr>
-                <w:top w:val="nil"/>
-                <w:left w:val="nil"/>
-                <w:bottom w:val="nil"/>
-                <w:right w:val="nil"/>
-                <w:between w:val="nil"/>
-              </w:pBdr>
-              <w:spacing w:line="240" w:lineRule="auto"/>
-            </w:pPr>
-          </w:p>
-        </w:tc>
-        <w:tc>
-          <w:tcPr>
-            <w:tcW w:w="2791" w:type="dxa"/>
+            <w:tcW w:w="8373" w:type="dxa"/>
+            <w:gridSpan w:val="3"/>
             <w:shd w:val="clear" w:color="auto" w:fill="auto"/>
             <w:tcMar>
               <w:top w:w="100" w:type="dxa"/>
@@ -691,57 +564,8 @@
         </w:tc>
         <w:tc>
           <w:tcPr>
-            <w:tcW w:w="2791" w:type="dxa"/>
-            <w:shd w:val="clear" w:color="auto" w:fill="auto"/>
-            <w:tcMar>
-              <w:top w:w="100" w:type="dxa"/>
-              <w:left w:w="100" w:type="dxa"/>
-              <w:bottom w:w="100" w:type="dxa"/>
-              <w:right w:w="100" w:type="dxa"/>
-            </w:tcMar>
-          </w:tcPr>
-          <w:p>
-            <w:pPr>
-              <w:widowControl w:val="0"/>
-              <w:pBdr>
-                <w:top w:val="nil"/>
-                <w:left w:val="nil"/>
-                <w:bottom w:val="nil"/>
-                <w:right w:val="nil"/>
-                <w:between w:val="nil"/>
-              </w:pBdr>
-              <w:spacing w:line="240" w:lineRule="auto"/>
-            </w:pPr>
-          </w:p>
-        </w:tc>
-        <w:tc>
-          <w:tcPr>
-            <w:tcW w:w="2791" w:type="dxa"/>
-            <w:shd w:val="clear" w:color="auto" w:fill="auto"/>
-            <w:tcMar>
-              <w:top w:w="100" w:type="dxa"/>
-              <w:left w:w="100" w:type="dxa"/>
-              <w:bottom w:w="100" w:type="dxa"/>
-              <w:right w:w="100" w:type="dxa"/>
-            </w:tcMar>
-          </w:tcPr>
-          <w:p>
-            <w:pPr>
-              <w:widowControl w:val="0"/>
-              <w:pBdr>
-                <w:top w:val="nil"/>
-                <w:left w:val="nil"/>
-                <w:bottom w:val="nil"/>
-                <w:right w:val="nil"/>
-                <w:between w:val="nil"/>
-              </w:pBdr>
-              <w:spacing w:line="240" w:lineRule="auto"/>
-            </w:pPr>
-          </w:p>
-        </w:tc>
-        <w:tc>
-          <w:tcPr>
-            <w:tcW w:w="2791" w:type="dxa"/>
+            <w:tcW w:w="8373" w:type="dxa"/>
+            <w:gridSpan w:val="3"/>
             <w:shd w:val="clear" w:color="auto" w:fill="auto"/>
             <w:tcMar>
               <w:top w:w="100" w:type="dxa"/>
@@ -793,13 +617,38 @@
               <w:rPr>
                 <w:rFonts w:ascii="Arial Unicode MS" w:eastAsia="Arial Unicode MS" w:hAnsi="Arial Unicode MS" w:cs="Arial Unicode MS"/>
               </w:rPr>
-              <w:t>시험케이스</w:t>
+              <w:t>시험케이스 ID</w:t>
             </w:r>
+          </w:p>
+        </w:tc>
+        <w:tc>
+          <w:tcPr>
+            <w:tcW w:w="2791" w:type="dxa"/>
+            <w:shd w:val="clear" w:color="auto" w:fill="D9D9D9"/>
+            <w:tcMar>
+              <w:top w:w="100" w:type="dxa"/>
+              <w:left w:w="100" w:type="dxa"/>
+              <w:bottom w:w="100" w:type="dxa"/>
+              <w:right w:w="100" w:type="dxa"/>
+            </w:tcMar>
+          </w:tcPr>
+          <w:p>
+            <w:pPr>
+              <w:widowControl w:val="0"/>
+              <w:pBdr>
+                <w:top w:val="nil"/>
+                <w:left w:val="nil"/>
+                <w:bottom w:val="nil"/>
+                <w:right w:val="nil"/>
+                <w:between w:val="nil"/>
+              </w:pBdr>
+              <w:spacing w:line="240" w:lineRule="auto"/>
+            </w:pPr>
             <w:r>
               <w:rPr>
                 <w:rFonts w:ascii="Arial Unicode MS" w:eastAsia="Arial Unicode MS" w:hAnsi="Arial Unicode MS" w:cs="Arial Unicode MS"/>
               </w:rPr>
-              <w:t xml:space="preserve"> ID</w:t>
+              <w:t>시험케이스 설명</w:t>
             </w:r>
           </w:p>
         </w:tc>
@@ -830,105 +679,38 @@
               <w:rPr>
                 <w:rFonts w:ascii="Arial Unicode MS" w:eastAsia="Arial Unicode MS" w:hAnsi="Arial Unicode MS" w:cs="Arial Unicode MS"/>
               </w:rPr>
-              <w:t>시험케이스</w:t>
+              <w:t>시험 절차</w:t>
             </w:r>
+          </w:p>
+        </w:tc>
+        <w:tc>
+          <w:tcPr>
+            <w:tcW w:w="2791" w:type="dxa"/>
+            <w:shd w:val="clear" w:color="auto" w:fill="D9D9D9"/>
+            <w:tcMar>
+              <w:top w:w="100" w:type="dxa"/>
+              <w:left w:w="100" w:type="dxa"/>
+              <w:bottom w:w="100" w:type="dxa"/>
+              <w:right w:w="100" w:type="dxa"/>
+            </w:tcMar>
+          </w:tcPr>
+          <w:p>
+            <w:pPr>
+              <w:widowControl w:val="0"/>
+              <w:pBdr>
+                <w:top w:val="nil"/>
+                <w:left w:val="nil"/>
+                <w:bottom w:val="nil"/>
+                <w:right w:val="nil"/>
+                <w:between w:val="nil"/>
+              </w:pBdr>
+              <w:spacing w:line="240" w:lineRule="auto"/>
+            </w:pPr>
             <w:r>
               <w:rPr>
                 <w:rFonts w:ascii="Arial Unicode MS" w:eastAsia="Arial Unicode MS" w:hAnsi="Arial Unicode MS" w:cs="Arial Unicode MS"/>
               </w:rPr>
-              <w:t xml:space="preserve"> </w:t>
-            </w:r>
-            <w:r>
-              <w:rPr>
-                <w:rFonts w:ascii="Arial Unicode MS" w:eastAsia="Arial Unicode MS" w:hAnsi="Arial Unicode MS" w:cs="Arial Unicode MS"/>
-              </w:rPr>
-              <w:t>설명</w:t>
-            </w:r>
-          </w:p>
-        </w:tc>
-        <w:tc>
-          <w:tcPr>
-            <w:tcW w:w="2791" w:type="dxa"/>
-            <w:shd w:val="clear" w:color="auto" w:fill="D9D9D9"/>
-            <w:tcMar>
-              <w:top w:w="100" w:type="dxa"/>
-              <w:left w:w="100" w:type="dxa"/>
-              <w:bottom w:w="100" w:type="dxa"/>
-              <w:right w:w="100" w:type="dxa"/>
-            </w:tcMar>
-          </w:tcPr>
-          <w:p>
-            <w:pPr>
-              <w:widowControl w:val="0"/>
-              <w:pBdr>
-                <w:top w:val="nil"/>
-                <w:left w:val="nil"/>
-                <w:bottom w:val="nil"/>
-                <w:right w:val="nil"/>
-                <w:between w:val="nil"/>
-              </w:pBdr>
-              <w:spacing w:line="240" w:lineRule="auto"/>
-            </w:pPr>
-            <w:r>
-              <w:rPr>
-                <w:rFonts w:ascii="Arial Unicode MS" w:eastAsia="Arial Unicode MS" w:hAnsi="Arial Unicode MS" w:cs="Arial Unicode MS"/>
-              </w:rPr>
-              <w:t>시험</w:t>
-            </w:r>
-            <w:r>
-              <w:rPr>
-                <w:rFonts w:ascii="Arial Unicode MS" w:eastAsia="Arial Unicode MS" w:hAnsi="Arial Unicode MS" w:cs="Arial Unicode MS"/>
-              </w:rPr>
-              <w:t xml:space="preserve"> </w:t>
-            </w:r>
-            <w:r>
-              <w:rPr>
-                <w:rFonts w:ascii="Arial Unicode MS" w:eastAsia="Arial Unicode MS" w:hAnsi="Arial Unicode MS" w:cs="Arial Unicode MS"/>
-              </w:rPr>
-              <w:t>절차</w:t>
-            </w:r>
-          </w:p>
-        </w:tc>
-        <w:tc>
-          <w:tcPr>
-            <w:tcW w:w="2791" w:type="dxa"/>
-            <w:shd w:val="clear" w:color="auto" w:fill="D9D9D9"/>
-            <w:tcMar>
-              <w:top w:w="100" w:type="dxa"/>
-              <w:left w:w="100" w:type="dxa"/>
-              <w:bottom w:w="100" w:type="dxa"/>
-              <w:right w:w="100" w:type="dxa"/>
-            </w:tcMar>
-          </w:tcPr>
-          <w:p>
-            <w:pPr>
-              <w:widowControl w:val="0"/>
-              <w:pBdr>
-                <w:top w:val="nil"/>
-                <w:left w:val="nil"/>
-                <w:bottom w:val="nil"/>
-                <w:right w:val="nil"/>
-                <w:between w:val="nil"/>
-              </w:pBdr>
-              <w:spacing w:line="240" w:lineRule="auto"/>
-            </w:pPr>
-            <w:r>
-              <w:rPr>
-                <w:rFonts w:ascii="Arial Unicode MS" w:eastAsia="Arial Unicode MS" w:hAnsi="Arial Unicode MS" w:cs="Arial Unicode MS"/>
-              </w:rPr>
-              <w:t>시나리오</w:t>
-            </w:r>
-            <w:r>
-              <w:rPr>
-                <w:rFonts w:ascii="Arial Unicode MS" w:eastAsia="Arial Unicode MS" w:hAnsi="Arial Unicode MS" w:cs="Arial Unicode MS"/>
-              </w:rPr>
-              <w:t xml:space="preserve"> </w:t>
-            </w:r>
-            <w:r>
-              <w:rPr>
-                <w:rFonts w:ascii="Arial Unicode MS" w:eastAsia="Arial Unicode MS" w:hAnsi="Arial Unicode MS" w:cs="Arial Unicode MS"/>
-              </w:rPr>
-              <w:t>설명</w:t>
+              <w:t>시나리오 설명</w:t>
             </w:r>
           </w:p>
         </w:tc>
@@ -1232,13 +1014,7 @@
               <w:rPr>
                 <w:rFonts w:ascii="Arial Unicode MS" w:eastAsia="Arial Unicode MS" w:hAnsi="Arial Unicode MS" w:cs="Arial Unicode MS"/>
               </w:rPr>
-              <w:t>시험시나리오</w:t>
-            </w:r>
-            <w:r>
-              <w:rPr>
-                <w:rFonts w:ascii="Arial Unicode MS" w:eastAsia="Arial Unicode MS" w:hAnsi="Arial Unicode MS" w:cs="Arial Unicode MS"/>
-              </w:rPr>
-              <w:t xml:space="preserve"> ID</w:t>
+              <w:t>시험시나리오 ID</w:t>
             </w:r>
           </w:p>
         </w:tc>
@@ -1366,13 +1142,7 @@
               <w:rPr>
                 <w:rFonts w:ascii="Arial Unicode MS" w:eastAsia="Arial Unicode MS" w:hAnsi="Arial Unicode MS" w:cs="Arial Unicode MS"/>
               </w:rPr>
-              <w:t>시험케이스</w:t>
-            </w:r>
-            <w:r>
-              <w:rPr>
-                <w:rFonts w:ascii="Arial Unicode MS" w:eastAsia="Arial Unicode MS" w:hAnsi="Arial Unicode MS" w:cs="Arial Unicode MS"/>
-              </w:rPr>
-              <w:t xml:space="preserve"> ID</w:t>
+              <w:t>시험케이스 ID</w:t>
             </w:r>
           </w:p>
         </w:tc>
@@ -1482,19 +1252,7 @@
               <w:rPr>
                 <w:rFonts w:ascii="Arial Unicode MS" w:eastAsia="Arial Unicode MS" w:hAnsi="Arial Unicode MS" w:cs="Arial Unicode MS"/>
               </w:rPr>
-              <w:t>시험</w:t>
-            </w:r>
-            <w:r>
-              <w:rPr>
-                <w:rFonts w:ascii="Arial Unicode MS" w:eastAsia="Arial Unicode MS" w:hAnsi="Arial Unicode MS" w:cs="Arial Unicode MS"/>
-              </w:rPr>
-              <w:t xml:space="preserve"> </w:t>
-            </w:r>
-            <w:r>
-              <w:rPr>
-                <w:rFonts w:ascii="Arial Unicode MS" w:eastAsia="Arial Unicode MS" w:hAnsi="Arial Unicode MS" w:cs="Arial Unicode MS"/>
-              </w:rPr>
-              <w:t>항목</w:t>
+              <w:t>시험 항목</w:t>
             </w:r>
           </w:p>
         </w:tc>

</xml_diff>